<commit_message>
Support per-level win and bonus rates
</commit_message>
<xml_diff>
--- a/docs/Golden_Eggs_API_Reference.docx
+++ b/docs/Golden_Eggs_API_Reference.docx
@@ -2086,6 +2086,12 @@
     <w:p>
       <w:pPr/>
       <w:r>
+        <w:t>- winRate and bonusRate can be set globally, or per level. If omitted on a level, the global rates are used.</w:t>
+      </w:r>
+    </w:p>
+    <w:p>
+      <w:pPr/>
+      <w:r>
         <w:t>- fullImageUrl and crackImageUrl should point to images hosted by the third-party CMS/CDN.</w:t>
       </w:r>
     </w:p>
@@ -2098,7 +2104,7 @@
     <w:p>
       <w:pPr/>
       <w:r>
-        <w:t>- Level object fields: label/name, cost, prize, fullImageUrl, crackImageUrl.</w:t>
+        <w:t>- Level object fields: label/name, cost, prize, winRate, bonusRate, fullImageUrl, crackImageUrl.</w:t>
       </w:r>
     </w:p>
     <w:p>
@@ -2130,7 +2136,7 @@
         <w:pStyle w:val="Code"/>
       </w:pPr>
       <w:r>
-        <w:t>{ "eggs": [{ "id": "gold", "name": "Gold Egg", "label": "Gold Egg", "levels": [{ "label": "Level 1", "cost": 100, "prize": 100, "fullImageUrl": "https://cdn.example/gold/full-1.png", "crackImageUrl": "https://cdn.example/gold/crack-1.png" }] }] }</w:t>
+        <w:t>{ "winRate": 0.42, "bonusRate": 0.05, "eggs": [{ "id": "gold", "name": "Gold Egg", "label": "Gold Egg", "levels": [{ "label": "Level 1", "cost": 100, "prize": 100, "winRate": 0.5, "bonusRate": 0.02, "fullImageUrl": "https://cdn.example/gold/full-1.png", "crackImageUrl": "https://cdn.example/gold/crack-1.png" }] }] }</w:t>
       </w:r>
     </w:p>
     <w:p>

</xml_diff>

<commit_message>
Allow configurable egg type skins
</commit_message>
<xml_diff>
--- a/docs/Golden_Eggs_API_Reference.docx
+++ b/docs/Golden_Eggs_API_Reference.docx
@@ -2110,6 +2110,18 @@
     <w:p>
       <w:pPr/>
       <w:r>
+        <w:t>- If egg type skin fields are omitted, the game inherits the existing gold/premium fallback design.</w:t>
+      </w:r>
+    </w:p>
+    <w:p>
+      <w:pPr/>
+      <w:r>
+        <w:t>- Egg type skin fields are optional: backgroundImageUrl, tabImageUrl, tabActiveImageUrl, buttonImageUrl, labelImageUrl.</w:t>
+      </w:r>
+    </w:p>
+    <w:p>
+      <w:pPr/>
+      <w:r>
         <w:t>- Each egg level can be a number for legacy configs, or an object for full third-party control.</w:t>
       </w:r>
     </w:p>
@@ -2136,7 +2148,7 @@
         <w:pStyle w:val="Code"/>
       </w:pPr>
       <w:r>
-        <w:t>{ "winRate": 0.42, "bonusRate": 0.05, "eggs": [{ "id": "gold", "name": "Gold Egg", "label": "Gold Egg", "levels": [{ "label": "Level 1", "cost": 100, "prize": 100, "winRate": 0.5, "bonusRate": 0.02, "fullImageUrl": "https://cdn.example/gold/full-1.png", "crackImageUrl": "https://cdn.example/gold/crack-1.png" }] }] }</w:t>
+        <w:t>{ "winRate": 0.42, "bonusRate": 0.05, "eggs": [{ "id": "gold", "name": "Gold Egg", "label": "Gold Egg", "backgroundImageUrl": "https://cdn.example/gold/bg.png", "tabImageUrl": "https://cdn.example/gold/tab.png", "tabActiveImageUrl": "https://cdn.example/gold/tab-active.png", "buttonImageUrl": "https://cdn.example/gold/button.png", "labelImageUrl": "https://cdn.example/gold/label.png", "levels": [{ "label": "Level 1", "cost": 100, "prize": 100, "winRate": 0.5, "bonusRate": 0.02, "fullImageUrl": "https://cdn.example/gold/full-1.png", "crackImageUrl": "https://cdn.example/gold/crack-1.png" }] }] }</w:t>
       </w:r>
     </w:p>
     <w:p>

</xml_diff>